<commit_message>
Improve backend learning workflow
</commit_message>
<xml_diff>
--- a/docs/student-backend-exercises-he/01_health_check.docx
+++ b/docs/student-backend-exercises-he/01_health_check.docx
@@ -93,6 +93,154 @@
           <w:rtl/>
           <w:lang w:bidi="he-IL"/>
         </w:rPr>
+        <w:t xml:space="preserve">מטרות והיערכות</w:t>
+      </w:r>
+    </w:p>
+    <w:p>
+      <w:pPr>
+        <w:bidi/>
+        <w:spacing w:after="120" w:line="300"/>
+        <w:jc w:val="right"/>
+      </w:pPr>
+      <w:r>
+        <w:rPr>
+          <w:rFonts w:ascii="Arial" w:cs="Arial" w:eastAsia="Arial" w:hAnsi="Arial"/>
+          <w:b/>
+          <w:bCs/>
+          <w:rtl/>
+          <w:lang w:bidi="he-IL"/>
+        </w:rPr>
+        <w:t xml:space="preserve">זמן משוער: 30–45 דקות</w:t>
+      </w:r>
+    </w:p>
+    <w:p>
+      <w:pPr>
+        <w:pStyle w:val="Heading2"/>
+        <w:bidi/>
+        <w:jc w:val="right"/>
+      </w:pPr>
+      <w:r>
+        <w:rPr>
+          <w:rFonts w:ascii="Arial" w:cs="Arial" w:eastAsia="Arial" w:hAnsi="Arial"/>
+          <w:b/>
+          <w:bCs/>
+          <w:rtl/>
+          <w:lang w:bidi="he-IL"/>
+        </w:rPr>
+        <w:t xml:space="preserve">ידע מוקדם</w:t>
+      </w:r>
+    </w:p>
+    <w:p>
+      <w:pPr>
+        <w:pStyle w:val="ListParagraph"/>
+        <w:numPr>
+          <w:ilvl w:val="0"/>
+          <w:numId w:val="2"/>
+        </w:numPr>
+        <w:bidi/>
+        <w:spacing w:after="80" w:line="300"/>
+        <w:jc w:val="right"/>
+      </w:pPr>
+      <w:r>
+        <w:rPr>
+          <w:rFonts w:ascii="Arial" w:cs="Arial" w:eastAsia="Arial" w:hAnsi="Arial"/>
+          <w:rtl/>
+          <w:lang w:bidi="he-IL"/>
+        </w:rPr>
+        <w:t xml:space="preserve">היכרות בסיסית עם Python, HTTP ו-JSON.</w:t>
+      </w:r>
+    </w:p>
+    <w:p>
+      <w:pPr>
+        <w:pStyle w:val="ListParagraph"/>
+        <w:numPr>
+          <w:ilvl w:val="0"/>
+          <w:numId w:val="2"/>
+        </w:numPr>
+        <w:bidi/>
+        <w:spacing w:after="80" w:line="300"/>
+        <w:jc w:val="right"/>
+      </w:pPr>
+      <w:r>
+        <w:rPr>
+          <w:rFonts w:ascii="Arial" w:cs="Arial" w:eastAsia="Arial" w:hAnsi="Arial"/>
+          <w:rtl/>
+          <w:lang w:bidi="he-IL"/>
+        </w:rPr>
+        <w:t xml:space="preserve">יכולת להפעיל סביבת Python ולהתקין את התלויות שסופקו.</w:t>
+      </w:r>
+    </w:p>
+    <w:p>
+      <w:pPr>
+        <w:pStyle w:val="Heading2"/>
+        <w:bidi/>
+        <w:jc w:val="right"/>
+      </w:pPr>
+      <w:r>
+        <w:rPr>
+          <w:rFonts w:ascii="Arial" w:cs="Arial" w:eastAsia="Arial" w:hAnsi="Arial"/>
+          <w:b/>
+          <w:bCs/>
+          <w:rtl/>
+          <w:lang w:bidi="he-IL"/>
+        </w:rPr>
+        <w:t xml:space="preserve">מה נבדק בתרגיל</w:t>
+      </w:r>
+    </w:p>
+    <w:p>
+      <w:pPr>
+        <w:pStyle w:val="ListParagraph"/>
+        <w:numPr>
+          <w:ilvl w:val="0"/>
+          <w:numId w:val="3"/>
+        </w:numPr>
+        <w:bidi/>
+        <w:spacing w:after="80" w:line="300"/>
+        <w:jc w:val="right"/>
+      </w:pPr>
+      <w:r>
+        <w:rPr>
+          <w:rFonts w:ascii="Arial" w:cs="Arial" w:eastAsia="Arial" w:hAnsi="Arial"/>
+          <w:rtl/>
+          <w:lang w:bidi="he-IL"/>
+        </w:rPr>
+        <w:t xml:space="preserve">הפעלת שירות Web.</w:t>
+      </w:r>
+    </w:p>
+    <w:p>
+      <w:pPr>
+        <w:pStyle w:val="ListParagraph"/>
+        <w:numPr>
+          <w:ilvl w:val="0"/>
+          <w:numId w:val="3"/>
+        </w:numPr>
+        <w:bidi/>
+        <w:spacing w:after="80" w:line="300"/>
+        <w:jc w:val="right"/>
+      </w:pPr>
+      <w:r>
+        <w:rPr>
+          <w:rFonts w:ascii="Arial" w:cs="Arial" w:eastAsia="Arial" w:hAnsi="Arial"/>
+          <w:rtl/>
+          <w:lang w:bidi="he-IL"/>
+        </w:rPr>
+        <w:t xml:space="preserve">חוזה בסיסי של בקשה, קוד מצב ותשובת JSON.</w:t>
+      </w:r>
+    </w:p>
+    <w:p>
+      <w:pPr>
+        <w:pStyle w:val="Heading1"/>
+        <w:bidi/>
+        <w:jc w:val="right"/>
+      </w:pPr>
+      <w:r>
+        <w:rPr>
+          <w:rFonts w:ascii="Arial" w:cs="Arial" w:eastAsia="Arial" w:hAnsi="Arial"/>
+          <w:b/>
+          <w:bCs/>
+          <w:rtl/>
+          <w:lang w:bidi="he-IL"/>
+        </w:rPr>
         <w:t xml:space="preserve">דרישות התרגיל</w:t>
       </w:r>
     </w:p>
@@ -101,10 +249,10 @@
         <w:pStyle w:val="ListParagraph"/>
         <w:numPr>
           <w:ilvl w:val="0"/>
-          <w:numId w:val="2"/>
-        </w:numPr>
-        <w:bidi/>
-        <w:spacing w:after="90" w:line="300"/>
+          <w:numId w:val="4"/>
+        </w:numPr>
+        <w:bidi/>
+        <w:spacing w:after="80" w:line="300"/>
         <w:jc w:val="right"/>
       </w:pPr>
       <w:r>
@@ -121,10 +269,10 @@
         <w:pStyle w:val="ListParagraph"/>
         <w:numPr>
           <w:ilvl w:val="0"/>
-          <w:numId w:val="2"/>
-        </w:numPr>
-        <w:bidi/>
-        <w:spacing w:after="90" w:line="300"/>
+          <w:numId w:val="4"/>
+        </w:numPr>
+        <w:bidi/>
+        <w:spacing w:after="80" w:line="300"/>
         <w:jc w:val="right"/>
       </w:pPr>
       <w:r>
@@ -141,10 +289,10 @@
         <w:pStyle w:val="ListParagraph"/>
         <w:numPr>
           <w:ilvl w:val="0"/>
-          <w:numId w:val="2"/>
-        </w:numPr>
-        <w:bidi/>
-        <w:spacing w:after="90" w:line="300"/>
+          <w:numId w:val="4"/>
+        </w:numPr>
+        <w:bidi/>
+        <w:spacing w:after="80" w:line="300"/>
         <w:jc w:val="right"/>
       </w:pPr>
       <w:r>
@@ -319,10 +467,10 @@
         <w:pStyle w:val="ListParagraph"/>
         <w:numPr>
           <w:ilvl w:val="0"/>
-          <w:numId w:val="3"/>
-        </w:numPr>
-        <w:bidi/>
-        <w:spacing w:after="90" w:line="300"/>
+          <w:numId w:val="5"/>
+        </w:numPr>
+        <w:bidi/>
+        <w:spacing w:after="80" w:line="300"/>
         <w:jc w:val="right"/>
       </w:pPr>
       <w:r>
@@ -339,10 +487,10 @@
         <w:pStyle w:val="ListParagraph"/>
         <w:numPr>
           <w:ilvl w:val="0"/>
-          <w:numId w:val="3"/>
-        </w:numPr>
-        <w:bidi/>
-        <w:spacing w:after="90" w:line="300"/>
+          <w:numId w:val="5"/>
+        </w:numPr>
+        <w:bidi/>
+        <w:spacing w:after="80" w:line="300"/>
         <w:jc w:val="right"/>
       </w:pPr>
       <w:r>
@@ -359,10 +507,10 @@
         <w:pStyle w:val="ListParagraph"/>
         <w:numPr>
           <w:ilvl w:val="0"/>
-          <w:numId w:val="3"/>
-        </w:numPr>
-        <w:bidi/>
-        <w:spacing w:after="90" w:line="300"/>
+          <w:numId w:val="5"/>
+        </w:numPr>
+        <w:bidi/>
+        <w:spacing w:after="80" w:line="300"/>
         <w:jc w:val="right"/>
       </w:pPr>
       <w:r>
@@ -372,6 +520,217 @@
           <w:lang w:bidi="he-IL"/>
         </w:rPr>
         <w:t xml:space="preserve">סוג התוכן של התשובה הוא JSON.</w:t>
+      </w:r>
+    </w:p>
+    <w:p>
+      <w:pPr>
+        <w:pStyle w:val="Heading1"/>
+        <w:bidi/>
+        <w:jc w:val="right"/>
+      </w:pPr>
+      <w:r>
+        <w:rPr>
+          <w:rFonts w:ascii="Arial" w:cs="Arial" w:eastAsia="Arial" w:hAnsi="Arial"/>
+          <w:b/>
+          <w:bCs/>
+          <w:rtl/>
+          <w:lang w:bidi="he-IL"/>
+        </w:rPr>
+        <w:t xml:space="preserve">מקרי שגיאה שחייבים לבדוק</w:t>
+      </w:r>
+    </w:p>
+    <w:p>
+      <w:pPr>
+        <w:pStyle w:val="ListParagraph"/>
+        <w:numPr>
+          <w:ilvl w:val="0"/>
+          <w:numId w:val="6"/>
+        </w:numPr>
+        <w:bidi/>
+        <w:spacing w:after="80" w:line="300"/>
+        <w:jc w:val="right"/>
+      </w:pPr>
+      <w:r>
+        <w:rPr>
+          <w:rFonts w:ascii="Arial" w:cs="Arial" w:eastAsia="Arial" w:hAnsi="Arial"/>
+          <w:rtl/>
+          <w:lang w:bidi="he-IL"/>
+        </w:rPr>
+        <w:t xml:space="preserve">נתיב או שיטת HTTP שגויים אינם נחשבים למימוש תקין.</w:t>
+      </w:r>
+    </w:p>
+    <w:p>
+      <w:pPr>
+        <w:pStyle w:val="ListParagraph"/>
+        <w:numPr>
+          <w:ilvl w:val="0"/>
+          <w:numId w:val="6"/>
+        </w:numPr>
+        <w:bidi/>
+        <w:spacing w:after="80" w:line="300"/>
+        <w:jc w:val="right"/>
+      </w:pPr>
+      <w:r>
+        <w:rPr>
+          <w:rFonts w:ascii="Arial" w:cs="Arial" w:eastAsia="Arial" w:hAnsi="Arial"/>
+          <w:rtl/>
+          <w:lang w:bidi="he-IL"/>
+        </w:rPr>
+        <w:t xml:space="preserve">התשובה חייבת להיות JSON תקין גם כאשר הלקוח אינו דפדפן.</w:t>
+      </w:r>
+    </w:p>
+    <w:p>
+      <w:pPr>
+        <w:pStyle w:val="Heading1"/>
+        <w:bidi/>
+        <w:jc w:val="right"/>
+      </w:pPr>
+      <w:r>
+        <w:rPr>
+          <w:rFonts w:ascii="Arial" w:cs="Arial" w:eastAsia="Arial" w:hAnsi="Arial"/>
+          <w:b/>
+          <w:bCs/>
+          <w:rtl/>
+          <w:lang w:bidi="he-IL"/>
+        </w:rPr>
+        <w:t xml:space="preserve">מה מגישים</w:t>
+      </w:r>
+    </w:p>
+    <w:p>
+      <w:pPr>
+        <w:pStyle w:val="ListParagraph"/>
+        <w:numPr>
+          <w:ilvl w:val="0"/>
+          <w:numId w:val="7"/>
+        </w:numPr>
+        <w:bidi/>
+        <w:spacing w:after="80" w:line="300"/>
+        <w:jc w:val="right"/>
+      </w:pPr>
+      <w:r>
+        <w:rPr>
+          <w:rFonts w:ascii="Arial" w:cs="Arial" w:eastAsia="Arial" w:hAnsi="Arial"/>
+          <w:rtl/>
+          <w:lang w:bidi="he-IL"/>
+        </w:rPr>
+        <w:t xml:space="preserve">קישור לקוד בנקודת הזמן של סיום התרגיל.</w:t>
+      </w:r>
+    </w:p>
+    <w:p>
+      <w:pPr>
+        <w:pStyle w:val="ListParagraph"/>
+        <w:numPr>
+          <w:ilvl w:val="0"/>
+          <w:numId w:val="7"/>
+        </w:numPr>
+        <w:bidi/>
+        <w:spacing w:after="80" w:line="300"/>
+        <w:jc w:val="right"/>
+      </w:pPr>
+      <w:r>
+        <w:rPr>
+          <w:rFonts w:ascii="Arial" w:cs="Arial" w:eastAsia="Arial" w:hAnsi="Arial"/>
+          <w:rtl/>
+          <w:lang w:bidi="he-IL"/>
+        </w:rPr>
+        <w:t xml:space="preserve">פלט של checkpoint 1 וצילום או העתק של בקשת health מוצלחת.</w:t>
+      </w:r>
+    </w:p>
+    <w:p>
+      <w:pPr>
+        <w:pStyle w:val="Heading1"/>
+        <w:bidi/>
+        <w:jc w:val="right"/>
+      </w:pPr>
+      <w:r>
+        <w:rPr>
+          <w:rFonts w:ascii="Arial" w:cs="Arial" w:eastAsia="Arial" w:hAnsi="Arial"/>
+          <w:b/>
+          <w:bCs/>
+          <w:rtl/>
+          <w:lang w:bidi="he-IL"/>
+        </w:rPr>
+        <w:t xml:space="preserve">רשימת בדיקה לסיום</w:t>
+      </w:r>
+    </w:p>
+    <w:p>
+      <w:pPr>
+        <w:pStyle w:val="ListParagraph"/>
+        <w:numPr>
+          <w:ilvl w:val="0"/>
+          <w:numId w:val="8"/>
+        </w:numPr>
+        <w:bidi/>
+        <w:spacing w:after="80" w:line="300"/>
+        <w:jc w:val="right"/>
+      </w:pPr>
+      <w:r>
+        <w:rPr>
+          <w:rFonts w:ascii="Arial" w:cs="Arial" w:eastAsia="Arial" w:hAnsi="Arial"/>
+          <w:rtl/>
+          <w:lang w:bidi="he-IL"/>
+        </w:rPr>
+        <w:t xml:space="preserve">כל נקודות הקצה שנדרשות עד לתרגיל זה מחזירות את קודי המצב וה-JSON שהוגדרו.</w:t>
+      </w:r>
+    </w:p>
+    <w:p>
+      <w:pPr>
+        <w:pStyle w:val="ListParagraph"/>
+        <w:numPr>
+          <w:ilvl w:val="0"/>
+          <w:numId w:val="8"/>
+        </w:numPr>
+        <w:bidi/>
+        <w:spacing w:after="80" w:line="300"/>
+        <w:jc w:val="right"/>
+      </w:pPr>
+      <w:r>
+        <w:rPr>
+          <w:rFonts w:ascii="Arial" w:cs="Arial" w:eastAsia="Arial" w:hAnsi="Arial"/>
+          <w:rtl/>
+          <w:lang w:bidi="he-IL"/>
+        </w:rPr>
+        <w:t xml:space="preserve">כל בדיקות ה-checkpoint הנוכחי והתרגילים הקודמים עוברות.</w:t>
+      </w:r>
+    </w:p>
+    <w:p>
+      <w:pPr>
+        <w:pStyle w:val="ListParagraph"/>
+        <w:numPr>
+          <w:ilvl w:val="0"/>
+          <w:numId w:val="8"/>
+        </w:numPr>
+        <w:bidi/>
+        <w:spacing w:after="80" w:line="300"/>
+        <w:jc w:val="right"/>
+      </w:pPr>
+      <w:r>
+        <w:rPr>
+          <w:rFonts w:ascii="Arial" w:cs="Arial" w:eastAsia="Arial" w:hAnsi="Arial"/>
+          <w:rtl/>
+          <w:lang w:bidi="he-IL"/>
+        </w:rPr>
+        <w:t xml:space="preserve">בדקתי לפחות מקרה הצלחה אחד ומקרה שגיאה אחד בלי לשנות את חוזה ה-API.</w:t>
+      </w:r>
+    </w:p>
+    <w:p>
+      <w:pPr>
+        <w:pStyle w:val="ListParagraph"/>
+        <w:numPr>
+          <w:ilvl w:val="0"/>
+          <w:numId w:val="8"/>
+        </w:numPr>
+        <w:bidi/>
+        <w:spacing w:after="80" w:line="300"/>
+        <w:jc w:val="right"/>
+      </w:pPr>
+      <w:r>
+        <w:rPr>
+          <w:rFonts w:ascii="Arial" w:cs="Arial" w:eastAsia="Arial" w:hAnsi="Arial"/>
+          <w:rtl/>
+          <w:lang w:bidi="he-IL"/>
+        </w:rPr>
+        <w:t xml:space="preserve">שמרתי את ראיות ההגשה הנדרשות ואני מסוגל להסביר את החלטות המימוש שלי.</w:t>
       </w:r>
     </w:p>
     <w:p>
@@ -412,7 +771,7 @@
       <w:headerReference w:type="default" r:id="rId7"/>
       <w:footerReference w:type="default" r:id="rId8"/>
       <w:pgSz w:w="12240" w:h="15840" w:orient="portrait"/>
-      <w:pgMar w:top="1080" w:right="1260" w:bottom="1080" w:left="1260" w:header="600" w:footer="600" w:gutter="0"/>
+      <w:pgMar w:top="1440" w:right="1440" w:bottom="1440" w:left="1440" w:header="708" w:footer="708" w:gutter="0"/>
       <w:pgNumType/>
       <w:docGrid w:linePitch="360"/>
     </w:sectPr>
@@ -647,7 +1006,7 @@
       <w:lvlText w:val="•"/>
       <w:lvlJc w:val="right"/>
       <w:pPr>
-        <w:ind w:right="720" w:hanging="360"/>
+        <w:ind w:right="540" w:hanging="270"/>
       </w:pPr>
     </w:lvl>
   </w:abstractNum>
@@ -659,7 +1018,67 @@
       <w:lvlText w:val="•"/>
       <w:lvlJc w:val="right"/>
       <w:pPr>
-        <w:ind w:right="720" w:hanging="360"/>
+        <w:ind w:right="540" w:hanging="270"/>
+      </w:pPr>
+    </w:lvl>
+  </w:abstractNum>
+  <w:abstractNum w:abstractNumId="4" w15:restartNumberingAfterBreak="0">
+    <w:multiLevelType w:val="hybridMultilevel"/>
+    <w:lvl w:ilvl="0" w15:tentative="1">
+      <w:start w:val="1"/>
+      <w:numFmt w:val="bullet"/>
+      <w:lvlText w:val="•"/>
+      <w:lvlJc w:val="right"/>
+      <w:pPr>
+        <w:ind w:right="540" w:hanging="270"/>
+      </w:pPr>
+    </w:lvl>
+  </w:abstractNum>
+  <w:abstractNum w:abstractNumId="5" w15:restartNumberingAfterBreak="0">
+    <w:multiLevelType w:val="hybridMultilevel"/>
+    <w:lvl w:ilvl="0" w15:tentative="1">
+      <w:start w:val="1"/>
+      <w:numFmt w:val="bullet"/>
+      <w:lvlText w:val="•"/>
+      <w:lvlJc w:val="right"/>
+      <w:pPr>
+        <w:ind w:right="540" w:hanging="270"/>
+      </w:pPr>
+    </w:lvl>
+  </w:abstractNum>
+  <w:abstractNum w:abstractNumId="6" w15:restartNumberingAfterBreak="0">
+    <w:multiLevelType w:val="hybridMultilevel"/>
+    <w:lvl w:ilvl="0" w15:tentative="1">
+      <w:start w:val="1"/>
+      <w:numFmt w:val="bullet"/>
+      <w:lvlText w:val="•"/>
+      <w:lvlJc w:val="right"/>
+      <w:pPr>
+        <w:ind w:right="540" w:hanging="270"/>
+      </w:pPr>
+    </w:lvl>
+  </w:abstractNum>
+  <w:abstractNum w:abstractNumId="7" w15:restartNumberingAfterBreak="0">
+    <w:multiLevelType w:val="hybridMultilevel"/>
+    <w:lvl w:ilvl="0" w15:tentative="1">
+      <w:start w:val="1"/>
+      <w:numFmt w:val="bullet"/>
+      <w:lvlText w:val="•"/>
+      <w:lvlJc w:val="right"/>
+      <w:pPr>
+        <w:ind w:right="540" w:hanging="270"/>
+      </w:pPr>
+    </w:lvl>
+  </w:abstractNum>
+  <w:abstractNum w:abstractNumId="8" w15:restartNumberingAfterBreak="0">
+    <w:multiLevelType w:val="hybridMultilevel"/>
+    <w:lvl w:ilvl="0" w15:tentative="1">
+      <w:start w:val="1"/>
+      <w:numFmt w:val="bullet"/>
+      <w:lvlText w:val="•"/>
+      <w:lvlJc w:val="right"/>
+      <w:pPr>
+        <w:ind w:right="540" w:hanging="270"/>
       </w:pPr>
     </w:lvl>
   </w:abstractNum>
@@ -670,13 +1089,43 @@
     </w:lvlOverride>
   </w:num>
   <w:num w:numId="2">
+    <w:abstractNumId w:val="4"/>
+    <w:lvlOverride w:ilvl="0">
+      <w:startOverride w:val="1"/>
+    </w:lvlOverride>
+  </w:num>
+  <w:num w:numId="3">
+    <w:abstractNumId w:val="5"/>
+    <w:lvlOverride w:ilvl="0">
+      <w:startOverride w:val="1"/>
+    </w:lvlOverride>
+  </w:num>
+  <w:num w:numId="4">
     <w:abstractNumId w:val="2"/>
     <w:lvlOverride w:ilvl="0">
       <w:startOverride w:val="1"/>
     </w:lvlOverride>
   </w:num>
-  <w:num w:numId="3">
+  <w:num w:numId="5">
     <w:abstractNumId w:val="3"/>
+    <w:lvlOverride w:ilvl="0">
+      <w:startOverride w:val="1"/>
+    </w:lvlOverride>
+  </w:num>
+  <w:num w:numId="6">
+    <w:abstractNumId w:val="6"/>
+    <w:lvlOverride w:ilvl="0">
+      <w:startOverride w:val="1"/>
+    </w:lvlOverride>
+  </w:num>
+  <w:num w:numId="7">
+    <w:abstractNumId w:val="7"/>
+    <w:lvlOverride w:ilvl="0">
+      <w:startOverride w:val="1"/>
+    </w:lvlOverride>
+  </w:num>
+  <w:num w:numId="8">
+    <w:abstractNumId w:val="8"/>
     <w:lvlOverride w:ilvl="0">
       <w:startOverride w:val="1"/>
     </w:lvlOverride>
@@ -873,14 +1322,14 @@
     <w:next w:val="Normal"/>
     <w:qFormat/>
     <w:pPr>
-      <w:spacing w:after="160" w:before="300"/>
+      <w:spacing w:after="200" w:before="360"/>
       <w:outlineLvl w:val="0"/>
     </w:pPr>
     <w:rPr>
       <w:rFonts w:ascii="Arial" w:cs="Arial" w:eastAsia="Arial" w:hAnsi="Arial"/>
       <w:b/>
       <w:bCs/>
-      <w:color w:val="2563EB"/>
+      <w:color w:val="2E74B5"/>
       <w:sz w:val="32"/>
       <w:szCs w:val="32"/>
     </w:rPr>
@@ -891,16 +1340,16 @@
     <w:next w:val="Normal"/>
     <w:qFormat/>
     <w:pPr>
-      <w:spacing w:after="120" w:before="240"/>
+      <w:spacing w:after="140" w:before="280"/>
       <w:outlineLvl w:val="1"/>
     </w:pPr>
     <w:rPr>
       <w:rFonts w:ascii="Arial" w:cs="Arial" w:eastAsia="Arial" w:hAnsi="Arial"/>
       <w:b/>
       <w:bCs/>
-      <w:color w:val="1E3A5F"/>
-      <w:sz w:val="27"/>
-      <w:szCs w:val="27"/>
+      <w:color w:val="2E74B5"/>
+      <w:sz w:val="26"/>
+      <w:szCs w:val="26"/>
     </w:rPr>
   </w:style>
   <w:style w:type="paragraph" w:styleId="Heading3">
@@ -909,14 +1358,14 @@
     <w:next w:val="Normal"/>
     <w:qFormat/>
     <w:pPr>
-      <w:spacing w:after="80" w:before="160"/>
+      <w:spacing w:after="100" w:before="200"/>
       <w:outlineLvl w:val="2"/>
     </w:pPr>
     <w:rPr>
       <w:rFonts w:ascii="Arial" w:cs="Arial" w:eastAsia="Arial" w:hAnsi="Arial"/>
       <w:b/>
       <w:bCs/>
-      <w:color w:val="334155"/>
+      <w:color w:val="1F4D78"/>
       <w:sz w:val="24"/>
       <w:szCs w:val="24"/>
     </w:rPr>

</xml_diff>

<commit_message>
Add UI checkpoint lab and Docker release bundle
</commit_message>
<xml_diff>
--- a/docs/student-backend-exercises-he/01_health_check.docx
+++ b/docs/student-backend-exercises-he/01_health_check.docx
@@ -93,6 +93,212 @@
           <w:rtl/>
           <w:lang w:bidi="he-IL"/>
         </w:rPr>
+        <w:t xml:space="preserve">המשימה בשפה פשוטה</w:t>
+      </w:r>
+    </w:p>
+    <w:p>
+      <w:pPr>
+        <w:bidi/>
+        <w:spacing w:after="120" w:line="300"/>
+        <w:jc w:val="right"/>
+      </w:pPr>
+      <w:r>
+        <w:rPr>
+          <w:rFonts w:ascii="Arial" w:cs="Arial" w:eastAsia="Arial" w:hAnsi="Arial"/>
+          <w:rtl/>
+          <w:lang w:bidi="he-IL"/>
+        </w:rPr>
+        <w:t xml:space="preserve">לפני שממשק המשחק יכול להציג שחקנים או לוח, הוא צריך לדעת שהשירות זמין ומוכן לקבל בקשות. המשימה הראשונה יוצרת בדיקת זמינות קטנה וחד-משמעית שאדם, דפדפן או מערכת בדיקות יכולים להבין באותה צורה.</w:t>
+      </w:r>
+    </w:p>
+    <w:p>
+      <w:pPr>
+        <w:pStyle w:val="Heading2"/>
+        <w:bidi/>
+        <w:jc w:val="right"/>
+      </w:pPr>
+      <w:r>
+        <w:rPr>
+          <w:rFonts w:ascii="Arial" w:cs="Arial" w:eastAsia="Arial" w:hAnsi="Arial"/>
+          <w:b/>
+          <w:bCs/>
+          <w:rtl/>
+          <w:lang w:bidi="he-IL"/>
+        </w:rPr>
+        <w:t xml:space="preserve">מה המשתמש מצפה שיקרה</w:t>
+      </w:r>
+    </w:p>
+    <w:p>
+      <w:pPr>
+        <w:pStyle w:val="ListParagraph"/>
+        <w:numPr>
+          <w:ilvl w:val="0"/>
+          <w:numId w:val="2"/>
+        </w:numPr>
+        <w:bidi/>
+        <w:spacing w:after="80" w:line="300"/>
+        <w:jc w:val="right"/>
+      </w:pPr>
+      <w:r>
+        <w:rPr>
+          <w:rFonts w:ascii="Arial" w:cs="Arial" w:eastAsia="Arial" w:hAnsi="Arial"/>
+          <w:rtl/>
+          <w:lang w:bidi="he-IL"/>
+        </w:rPr>
+        <w:t xml:space="preserve">לקוח שולח בקשת GET לכתובת בדיקת התקינות.</w:t>
+      </w:r>
+    </w:p>
+    <w:p>
+      <w:pPr>
+        <w:pStyle w:val="ListParagraph"/>
+        <w:numPr>
+          <w:ilvl w:val="0"/>
+          <w:numId w:val="2"/>
+        </w:numPr>
+        <w:bidi/>
+        <w:spacing w:after="80" w:line="300"/>
+        <w:jc w:val="right"/>
+      </w:pPr>
+      <w:r>
+        <w:rPr>
+          <w:rFonts w:ascii="Arial" w:cs="Arial" w:eastAsia="Arial" w:hAnsi="Arial"/>
+          <w:rtl/>
+          <w:lang w:bidi="he-IL"/>
+        </w:rPr>
+        <w:t xml:space="preserve">השירות מאשר שהבקשה הצליחה באמצעות קוד 200.</w:t>
+      </w:r>
+    </w:p>
+    <w:p>
+      <w:pPr>
+        <w:pStyle w:val="ListParagraph"/>
+        <w:numPr>
+          <w:ilvl w:val="0"/>
+          <w:numId w:val="2"/>
+        </w:numPr>
+        <w:bidi/>
+        <w:spacing w:after="80" w:line="300"/>
+        <w:jc w:val="right"/>
+      </w:pPr>
+      <w:r>
+        <w:rPr>
+          <w:rFonts w:ascii="Arial" w:cs="Arial" w:eastAsia="Arial" w:hAnsi="Arial"/>
+          <w:rtl/>
+          <w:lang w:bidi="he-IL"/>
+        </w:rPr>
+        <w:t xml:space="preserve">הלקוח מקבל JSON קצר שמצהיר כי מצב השירות הוא ok.</w:t>
+      </w:r>
+    </w:p>
+    <w:p>
+      <w:pPr>
+        <w:pStyle w:val="Heading2"/>
+        <w:bidi/>
+        <w:jc w:val="right"/>
+      </w:pPr>
+      <w:r>
+        <w:rPr>
+          <w:rFonts w:ascii="Arial" w:cs="Arial" w:eastAsia="Arial" w:hAnsi="Arial"/>
+          <w:b/>
+          <w:bCs/>
+          <w:rtl/>
+          <w:lang w:bidi="he-IL"/>
+        </w:rPr>
+        <w:t xml:space="preserve">מונחים מקצועיים במסמך</w:t>
+      </w:r>
+    </w:p>
+    <w:p>
+      <w:pPr>
+        <w:pStyle w:val="ListParagraph"/>
+        <w:numPr>
+          <w:ilvl w:val="0"/>
+          <w:numId w:val="3"/>
+        </w:numPr>
+        <w:bidi/>
+        <w:spacing w:after="80" w:line="300"/>
+        <w:jc w:val="right"/>
+      </w:pPr>
+      <w:r>
+        <w:rPr>
+          <w:rFonts w:ascii="Arial" w:cs="Arial" w:eastAsia="Arial" w:hAnsi="Arial"/>
+          <w:rtl/>
+          <w:lang w:bidi="he-IL"/>
+        </w:rPr>
+        <w:t xml:space="preserve">Endpoint — כתובת ושיטת HTTP שמייצגות פעולה אחת שהשירות מציע.</w:t>
+      </w:r>
+    </w:p>
+    <w:p>
+      <w:pPr>
+        <w:pStyle w:val="ListParagraph"/>
+        <w:numPr>
+          <w:ilvl w:val="0"/>
+          <w:numId w:val="3"/>
+        </w:numPr>
+        <w:bidi/>
+        <w:spacing w:after="80" w:line="300"/>
+        <w:jc w:val="right"/>
+      </w:pPr>
+      <w:r>
+        <w:rPr>
+          <w:rFonts w:ascii="Arial" w:cs="Arial" w:eastAsia="Arial" w:hAnsi="Arial"/>
+          <w:rtl/>
+          <w:lang w:bidi="he-IL"/>
+        </w:rPr>
+        <w:t xml:space="preserve">HTTP status — מספר שמסביר אם הבקשה הצליחה או נכשלה; 200 פירושו הצלחה.</w:t>
+      </w:r>
+    </w:p>
+    <w:p>
+      <w:pPr>
+        <w:pStyle w:val="ListParagraph"/>
+        <w:numPr>
+          <w:ilvl w:val="0"/>
+          <w:numId w:val="3"/>
+        </w:numPr>
+        <w:bidi/>
+        <w:spacing w:after="80" w:line="300"/>
+        <w:jc w:val="right"/>
+      </w:pPr>
+      <w:r>
+        <w:rPr>
+          <w:rFonts w:ascii="Arial" w:cs="Arial" w:eastAsia="Arial" w:hAnsi="Arial"/>
+          <w:rtl/>
+          <w:lang w:bidi="he-IL"/>
+        </w:rPr>
+        <w:t xml:space="preserve">JSON — מבנה טקסט מוסכם להעברת נתונים בין הממשק לשרת.</w:t>
+      </w:r>
+    </w:p>
+    <w:p>
+      <w:pPr>
+        <w:shd w:fill="F7FEE7" w:val="clear"/>
+        <w:bidi/>
+        <w:spacing w:after="180" w:before="80" w:line="300"/>
+        <w:ind w:left="160" w:right="160"/>
+        <w:jc w:val="right"/>
+      </w:pPr>
+      <w:r>
+        <w:rPr>
+          <w:rFonts w:ascii="Arial" w:cs="Arial" w:eastAsia="Arial" w:hAnsi="Arial"/>
+          <w:b/>
+          <w:bCs/>
+          <w:color w:val="365314"/>
+          <w:rtl/>
+          <w:lang w:bidi="he-IL"/>
+        </w:rPr>
+        <w:t xml:space="preserve">גבולות המשימה: בשלב זה אין משחק, שחקנים או לוח. נדרשת רק הוכחה שהשירות פעיל ומחזיר את החוזה המדויק.</w:t>
+      </w:r>
+    </w:p>
+    <w:p>
+      <w:pPr>
+        <w:pStyle w:val="Heading1"/>
+        <w:bidi/>
+        <w:jc w:val="right"/>
+      </w:pPr>
+      <w:r>
+        <w:rPr>
+          <w:rFonts w:ascii="Arial" w:cs="Arial" w:eastAsia="Arial" w:hAnsi="Arial"/>
+          <w:b/>
+          <w:bCs/>
+          <w:rtl/>
+          <w:lang w:bidi="he-IL"/>
+        </w:rPr>
         <w:t xml:space="preserve">מטרות והיערכות</w:t>
       </w:r>
     </w:p>
@@ -135,7 +341,7 @@
         <w:pStyle w:val="ListParagraph"/>
         <w:numPr>
           <w:ilvl w:val="0"/>
-          <w:numId w:val="2"/>
+          <w:numId w:val="4"/>
         </w:numPr>
         <w:bidi/>
         <w:spacing w:after="80" w:line="300"/>
@@ -155,7 +361,7 @@
         <w:pStyle w:val="ListParagraph"/>
         <w:numPr>
           <w:ilvl w:val="0"/>
-          <w:numId w:val="2"/>
+          <w:numId w:val="4"/>
         </w:numPr>
         <w:bidi/>
         <w:spacing w:after="80" w:line="300"/>
@@ -192,7 +398,7 @@
         <w:pStyle w:val="ListParagraph"/>
         <w:numPr>
           <w:ilvl w:val="0"/>
-          <w:numId w:val="3"/>
+          <w:numId w:val="5"/>
         </w:numPr>
         <w:bidi/>
         <w:spacing w:after="80" w:line="300"/>
@@ -212,7 +418,7 @@
         <w:pStyle w:val="ListParagraph"/>
         <w:numPr>
           <w:ilvl w:val="0"/>
-          <w:numId w:val="3"/>
+          <w:numId w:val="5"/>
         </w:numPr>
         <w:bidi/>
         <w:spacing w:after="80" w:line="300"/>
@@ -249,7 +455,7 @@
         <w:pStyle w:val="ListParagraph"/>
         <w:numPr>
           <w:ilvl w:val="0"/>
-          <w:numId w:val="4"/>
+          <w:numId w:val="6"/>
         </w:numPr>
         <w:bidi/>
         <w:spacing w:after="80" w:line="300"/>
@@ -269,7 +475,7 @@
         <w:pStyle w:val="ListParagraph"/>
         <w:numPr>
           <w:ilvl w:val="0"/>
-          <w:numId w:val="4"/>
+          <w:numId w:val="6"/>
         </w:numPr>
         <w:bidi/>
         <w:spacing w:after="80" w:line="300"/>
@@ -289,7 +495,7 @@
         <w:pStyle w:val="ListParagraph"/>
         <w:numPr>
           <w:ilvl w:val="0"/>
-          <w:numId w:val="4"/>
+          <w:numId w:val="6"/>
         </w:numPr>
         <w:bidi/>
         <w:spacing w:after="80" w:line="300"/>
@@ -467,7 +673,7 @@
         <w:pStyle w:val="ListParagraph"/>
         <w:numPr>
           <w:ilvl w:val="0"/>
-          <w:numId w:val="5"/>
+          <w:numId w:val="7"/>
         </w:numPr>
         <w:bidi/>
         <w:spacing w:after="80" w:line="300"/>
@@ -487,7 +693,7 @@
         <w:pStyle w:val="ListParagraph"/>
         <w:numPr>
           <w:ilvl w:val="0"/>
-          <w:numId w:val="5"/>
+          <w:numId w:val="7"/>
         </w:numPr>
         <w:bidi/>
         <w:spacing w:after="80" w:line="300"/>
@@ -507,7 +713,7 @@
         <w:pStyle w:val="ListParagraph"/>
         <w:numPr>
           <w:ilvl w:val="0"/>
-          <w:numId w:val="5"/>
+          <w:numId w:val="7"/>
         </w:numPr>
         <w:bidi/>
         <w:spacing w:after="80" w:line="300"/>
@@ -544,7 +750,7 @@
         <w:pStyle w:val="ListParagraph"/>
         <w:numPr>
           <w:ilvl w:val="0"/>
-          <w:numId w:val="6"/>
+          <w:numId w:val="8"/>
         </w:numPr>
         <w:bidi/>
         <w:spacing w:after="80" w:line="300"/>
@@ -564,7 +770,7 @@
         <w:pStyle w:val="ListParagraph"/>
         <w:numPr>
           <w:ilvl w:val="0"/>
-          <w:numId w:val="6"/>
+          <w:numId w:val="8"/>
         </w:numPr>
         <w:bidi/>
         <w:spacing w:after="80" w:line="300"/>
@@ -601,7 +807,7 @@
         <w:pStyle w:val="ListParagraph"/>
         <w:numPr>
           <w:ilvl w:val="0"/>
-          <w:numId w:val="7"/>
+          <w:numId w:val="9"/>
         </w:numPr>
         <w:bidi/>
         <w:spacing w:after="80" w:line="300"/>
@@ -621,7 +827,7 @@
         <w:pStyle w:val="ListParagraph"/>
         <w:numPr>
           <w:ilvl w:val="0"/>
-          <w:numId w:val="7"/>
+          <w:numId w:val="9"/>
         </w:numPr>
         <w:bidi/>
         <w:spacing w:after="80" w:line="300"/>
@@ -658,7 +864,7 @@
         <w:pStyle w:val="ListParagraph"/>
         <w:numPr>
           <w:ilvl w:val="0"/>
-          <w:numId w:val="8"/>
+          <w:numId w:val="10"/>
         </w:numPr>
         <w:bidi/>
         <w:spacing w:after="80" w:line="300"/>
@@ -678,7 +884,7 @@
         <w:pStyle w:val="ListParagraph"/>
         <w:numPr>
           <w:ilvl w:val="0"/>
-          <w:numId w:val="8"/>
+          <w:numId w:val="10"/>
         </w:numPr>
         <w:bidi/>
         <w:spacing w:after="80" w:line="300"/>
@@ -698,7 +904,7 @@
         <w:pStyle w:val="ListParagraph"/>
         <w:numPr>
           <w:ilvl w:val="0"/>
-          <w:numId w:val="8"/>
+          <w:numId w:val="10"/>
         </w:numPr>
         <w:bidi/>
         <w:spacing w:after="80" w:line="300"/>
@@ -718,7 +924,7 @@
         <w:pStyle w:val="ListParagraph"/>
         <w:numPr>
           <w:ilvl w:val="0"/>
-          <w:numId w:val="8"/>
+          <w:numId w:val="10"/>
         </w:numPr>
         <w:bidi/>
         <w:spacing w:after="80" w:line="300"/>
@@ -731,40 +937,6 @@
           <w:lang w:bidi="he-IL"/>
         </w:rPr>
         <w:t xml:space="preserve">שמרתי את ראיות ההגשה הנדרשות ואני מסוגל להסביר את החלטות המימוש שלי.</w:t>
-      </w:r>
-    </w:p>
-    <w:p>
-      <w:pPr>
-        <w:pStyle w:val="Heading1"/>
-        <w:bidi/>
-        <w:jc w:val="right"/>
-      </w:pPr>
-      <w:r>
-        <w:rPr>
-          <w:rFonts w:ascii="Arial" w:cs="Arial" w:eastAsia="Arial" w:hAnsi="Arial"/>
-          <w:b/>
-          <w:bCs/>
-          <w:rtl/>
-          <w:lang w:bidi="he-IL"/>
-        </w:rPr>
-        <w:t xml:space="preserve">תנאי סיום</w:t>
-      </w:r>
-    </w:p>
-    <w:p>
-      <w:pPr>
-        <w:bidi/>
-        <w:spacing w:after="120" w:line="300"/>
-        <w:jc w:val="right"/>
-      </w:pPr>
-      <w:r>
-        <w:rPr>
-          <w:rFonts w:ascii="Arial" w:cs="Arial" w:eastAsia="Arial" w:hAnsi="Arial"/>
-          <w:b/>
-          <w:bCs/>
-          <w:rtl/>
-          <w:lang w:bidi="he-IL"/>
-        </w:rPr>
-        <w:t xml:space="preserve">התרגיל הושלם כאשר כל הדרישות ובדיקות הקבלה מתקיימות, בלי לשנות את חוזה הבקשות והתשובות.</w:t>
       </w:r>
     </w:p>
     <w:sectPr>
@@ -1082,6 +1254,30 @@
       </w:pPr>
     </w:lvl>
   </w:abstractNum>
+  <w:abstractNum w:abstractNumId="9" w15:restartNumberingAfterBreak="0">
+    <w:multiLevelType w:val="hybridMultilevel"/>
+    <w:lvl w:ilvl="0" w15:tentative="1">
+      <w:start w:val="1"/>
+      <w:numFmt w:val="bullet"/>
+      <w:lvlText w:val="•"/>
+      <w:lvlJc w:val="right"/>
+      <w:pPr>
+        <w:ind w:right="540" w:hanging="270"/>
+      </w:pPr>
+    </w:lvl>
+  </w:abstractNum>
+  <w:abstractNum w:abstractNumId="10" w15:restartNumberingAfterBreak="0">
+    <w:multiLevelType w:val="hybridMultilevel"/>
+    <w:lvl w:ilvl="0" w15:tentative="1">
+      <w:start w:val="1"/>
+      <w:numFmt w:val="bullet"/>
+      <w:lvlText w:val="•"/>
+      <w:lvlJc w:val="right"/>
+      <w:pPr>
+        <w:ind w:right="540" w:hanging="270"/>
+      </w:pPr>
+    </w:lvl>
+  </w:abstractNum>
   <w:num w:numId="1">
     <w:abstractNumId w:val="1"/>
     <w:lvlOverride w:ilvl="0">
@@ -1089,42 +1285,54 @@
     </w:lvlOverride>
   </w:num>
   <w:num w:numId="2">
+    <w:abstractNumId w:val="9"/>
+    <w:lvlOverride w:ilvl="0">
+      <w:startOverride w:val="1"/>
+    </w:lvlOverride>
+  </w:num>
+  <w:num w:numId="3">
+    <w:abstractNumId w:val="10"/>
+    <w:lvlOverride w:ilvl="0">
+      <w:startOverride w:val="1"/>
+    </w:lvlOverride>
+  </w:num>
+  <w:num w:numId="4">
     <w:abstractNumId w:val="4"/>
     <w:lvlOverride w:ilvl="0">
       <w:startOverride w:val="1"/>
     </w:lvlOverride>
   </w:num>
-  <w:num w:numId="3">
+  <w:num w:numId="5">
     <w:abstractNumId w:val="5"/>
     <w:lvlOverride w:ilvl="0">
       <w:startOverride w:val="1"/>
     </w:lvlOverride>
   </w:num>
-  <w:num w:numId="4">
+  <w:num w:numId="6">
     <w:abstractNumId w:val="2"/>
     <w:lvlOverride w:ilvl="0">
       <w:startOverride w:val="1"/>
     </w:lvlOverride>
   </w:num>
-  <w:num w:numId="5">
+  <w:num w:numId="7">
     <w:abstractNumId w:val="3"/>
     <w:lvlOverride w:ilvl="0">
       <w:startOverride w:val="1"/>
     </w:lvlOverride>
   </w:num>
-  <w:num w:numId="6">
+  <w:num w:numId="8">
     <w:abstractNumId w:val="6"/>
     <w:lvlOverride w:ilvl="0">
       <w:startOverride w:val="1"/>
     </w:lvlOverride>
   </w:num>
-  <w:num w:numId="7">
+  <w:num w:numId="9">
     <w:abstractNumId w:val="7"/>
     <w:lvlOverride w:ilvl="0">
       <w:startOverride w:val="1"/>
     </w:lvlOverride>
   </w:num>
-  <w:num w:numId="8">
+  <w:num w:numId="10">
     <w:abstractNumId w:val="8"/>
     <w:lvlOverride w:ilvl="0">
       <w:startOverride w:val="1"/>

</xml_diff>